<commit_message>
Added spreadsheet with updates to FS inventory
</commit_message>
<xml_diff>
--- a/Documents/Forest Service Lidar Indexing Project.docx
+++ b/Documents/Forest Service Lidar Indexing Project.docx
@@ -429,7 +429,7 @@
     </w:p>
     <w:p>
       <w:r>
-        <w:t>T:\FS\Reference\RSImagery\ProcessedData\r06\R06_DRM_Deliverables\PointCloud</w:t>
+        <w:t>:\FS\Reference\RSImagery\ProcessedData\r06\R06_DRM_Deliverables\PointCloud</w:t>
       </w:r>
     </w:p>
     <w:p>
@@ -2420,7 +2420,13 @@
               <w:t>. Blank if assets contained CRS or no CRS was assigned</w:t>
             </w:r>
             <w:r>
-              <w:t>. The assignment could have been done using information in the folder name (as with some R6 data) or information from the geoTIFF tags in point files read using PDAL.</w:t>
+              <w:t>. The assignment could have been done using information in the folder name (as with some R6 data)</w:t>
+            </w:r>
+            <w:r>
+              <w:t>, WKT in the point files read with the C++ function</w:t>
+            </w:r>
+            <w:r>
+              <w:t xml:space="preserve"> or information from the geoTIFF tags in point files read using PDAL.</w:t>
             </w:r>
           </w:p>
         </w:tc>

</xml_diff>